<commit_message>
Amplia citações do projeto de pesquisa (7 → 11 referências)
Adicionados: Anderson (1998), Luo e Homburg (2007),
Mudambi e Schuff (2010), Zhu e Zhang (2010).
Atualizado Fávero e Belfiore para 2ª edição (2024).
</commit_message>
<xml_diff>
--- a/Projeto_de_Pesquisa.docx
+++ b/Projeto_de_Pesquisa.docx
@@ -99,7 +99,7 @@
           <w:rFonts w:ascii="Arial" w:hAnsi="Arial"/>
           <w:sz w:val="22"/>
         </w:rPr>
-        <w:t>O comércio eletrônico brasileiro vem crescendo de forma consistente nos últimos anos. Com esse crescimento, multiplicam-se também as situações em que o consumidor tem uma experiência aquém do esperado — atrasos na entrega, produtos que chegam danificados, divergência entre o que foi anunciado e o que foi recebido. Essas experiências resultam, na maioria das vezes, em avaliações negativas nos marketplaces, o que prejudica tanto o vendedor quanto a plataforma como um todo.</w:t>
+        <w:t>O comércio eletrônico brasileiro vem crescendo de forma consistente nos últimos anos. Com esse crescimento, multiplicam-se também as situações em que o consumidor tem uma experiência aquém do esperado — atrasos na entrega, produtos que chegam danificados, divergência entre o que foi anunciado e o que foi recebido. Essas experiências resultam, na maioria das vezes, em avaliações negativas nos marketplaces, o que prejudica tanto o vendedor quanto a plataforma como um todo. Luo e Homburg (2007) mostraram que os efeitos da satisfação do consumidor vão muito além da recompra, influenciando inclusive a eficiência dos investimentos em marketing da empresa — o que torna o tema relevante também do ponto de vista financeiro.</w:t>
       </w:r>
     </w:p>
     <w:p>
@@ -112,7 +112,7 @@
           <w:rFonts w:ascii="Arial" w:hAnsi="Arial"/>
           <w:sz w:val="22"/>
         </w:rPr>
-        <w:t>Do ponto de vista teórico, a satisfação do consumidor pode ser entendida como o resultado da comparação entre a expectativa prévia e o desempenho percebido do serviço. Parasuraman et al. (1985) propuseram que lacunas entre esses dois elementos são a principal causa de percepção de baixa qualidade. No comércio eletrônico, essas lacunas se manifestam em etapas específicas da jornada de compra — especialmente na logística de entrega, que frequentemente foge ao controle direto do vendedor. Kotler e Keller (2018) reforçam que a gestão da experiência do cliente é um dos pilares para a sustentabilidade de qualquer operação de varejo, e isso vale tanto para o varejo físico quanto para o digital.</w:t>
+        <w:t>Do ponto de vista teórico, a satisfação do consumidor pode ser entendida como o resultado da comparação entre a expectativa prévia e o desempenho percebido do serviço. Parasuraman et al. (1985) propuseram que lacunas entre esses dois elementos são a principal causa de percepção de baixa qualidade. No comércio eletrônico, essas lacunas se manifestam em etapas específicas da jornada de compra — especialmente na logística de entrega, que frequentemente foge ao controle direto do vendedor. Kotler e Keller (2018) reforçam que a gestão da experiência do cliente é um dos pilares para a sustentabilidade de qualquer operação de varejo, e isso vale tanto para o varejo físico quanto para o digital. Anderson (1998) mostrou que consumidores insatisfeitos tendem a se engajar mais em comunicação boca-a-boca do que consumidores satisfeitos, o que no ambiente digital se traduz em avaliações negativas com alcance potencialmente muito maior.</w:t>
       </w:r>
     </w:p>
     <w:p>
@@ -125,7 +125,7 @@
           <w:rFonts w:ascii="Arial" w:hAnsi="Arial"/>
           <w:sz w:val="22"/>
         </w:rPr>
-        <w:t>Chevalier e Mayzlin (2006) demonstraram que avaliações online exercem impacto direto sobre as vendas, o que reforça a importância de se compreender quais fatores levam o consumidor a atribuir notas baixas. No entanto, a maioria das pesquisas sobre insatisfação em e-commerce trata o problema de forma binária: o consumidor está ou não está satisfeito. Essa simplificação ignora a intensidade do fenômeno. Um vendedor com 3 avaliações negativas em 50 transações enfrenta uma realidade completamente diferente daquele que acumula 25 avaliações negativas em 100 transações, embora ambos possam ser classificados como "insatisfatórios" em uma análise binária. A contagem de reviews negativos é uma variável discreta e não-negativa, e exige tratamento estatístico adequado.</w:t>
+        <w:t>Diversos estudos confirmam que avaliações online exercem impacto direto sobre o desempenho comercial. Chevalier e Mayzlin (2006) demonstraram que o volume e a valência dos reviews afetam as vendas de livros em plataformas online. Zhu e Zhang (2010) chegaram a conclusões semelhantes no mercado de jogos eletrônicos, observando que o efeito dos reviews é mais forte para produtos menos populares. Mudambi e Schuff (2010) investigaram o que torna um review útil para o consumidor, identificando que a profundidade do texto e a moderação na nota são fatores determinantes. A maioria dessas pesquisas, contudo, trata o fenômeno pelo lado do consumidor que lê o review. Pouco se investigou sobre os determinantes operacionais que levam um vendedor a acumular avaliações negativas — perspectiva que este trabalho pretende explorar.</w:t>
       </w:r>
     </w:p>
     <w:p>
@@ -138,7 +138,7 @@
           <w:rFonts w:ascii="Arial" w:hAnsi="Arial"/>
           <w:sz w:val="22"/>
         </w:rPr>
-        <w:t>Para variáveis com essa natureza, os modelos de regressão para dados de contagem são o ferramental apropriado. O modelo de Poisson é o ponto de partida, mas assume que a variância condicional é igual à média — pressuposto frequentemente violado em dados reais, configurando o que se conhece como sobredispersão. Quando isso acontece, a regressão Binomial Negativa se torna a alternativa natural, pois acomoda essa variabilidade adicional por meio de um parâmetro extra (Cameron e Trivedi, 2013; Hilbe, 2011). Fávero e Belfiore (2017) detalham a aplicação prática desses modelos em contextos econômicos e de negócios, incluindo os testes diagnósticos necessários para a seleção entre Poisson e Binomial Negativa.</w:t>
+        <w:t>A contagem de reviews negativos por vendedor é uma variável discreta e não-negativa, o que requer modelos de regressão próprios para dados de contagem. O modelo de Poisson é o ponto de partida natural, mas assume que a variância condicional é igual à média — pressuposto frequentemente violado em dados reais, configurando o que se conhece como sobredispersão. Quando isso acontece, a regressão Binomial Negativa se torna a alternativa recomendada, pois acomoda essa variabilidade adicional por meio de um parâmetro extra (Cameron e Trivedi, 2013; Hilbe, 2011). Fávero e Belfiore (2024) detalham a aplicação prática desses modelos em contextos econômicos e de negócios, incluindo os testes diagnósticos necessários para a seleção entre Poisson e Binomial Negativa.</w:t>
       </w:r>
     </w:p>
     <w:p>
@@ -320,7 +320,7 @@
           <w:rFonts w:ascii="Arial" w:hAnsi="Arial"/>
           <w:sz w:val="22"/>
         </w:rPr>
-        <w:t>A modelagem seguirá o procedimento descrito por Cameron e Trivedi (2013) e Fávero e Belfiore (2017). Primeiro, será estimado um modelo de regressão Poisson como baseline, utilizando o método de mínimos quadrados iterativamente reponderados (IRLS). Em seguida, será aplicado o teste de sobredispersão de Cameron e Trivedi para verificar se a variância condicional excede a média condicional. Caso a sobredispersão seja confirmada, será estimado um modelo de regressão Binomial Negativa (NB2), com o parâmetro de dispersão (alfa) estimado pelo método dos momentos. A comparação formal entre os dois modelos será feita pelo teste de razão de verossimilhança.</w:t>
+        <w:t>A modelagem seguirá o procedimento descrito por Cameron e Trivedi (2013) e Fávero e Belfiore (2024). Primeiro, será estimado um modelo de regressão Poisson como baseline, utilizando o método de mínimos quadrados iterativamente reponderados (IRLS). Em seguida, será aplicado o teste de sobredispersão de Cameron e Trivedi para verificar se a variância condicional excede a média condicional. Caso a sobredispersão seja confirmada, será estimado um modelo de regressão Binomial Negativa (NB2), com o parâmetro de dispersão (alfa) estimado pelo método dos momentos. A comparação formal entre os dois modelos será feita pelo teste de razão de verossimilhança.</w:t>
       </w:r>
     </w:p>
     <w:p>
@@ -1375,6 +1375,19 @@
           <w:rFonts w:ascii="Arial" w:hAnsi="Arial"/>
           <w:sz w:val="22"/>
         </w:rPr>
+        <w:t>Anderson, E.W. 1998. Customer satisfaction and word of mouth. Journal of Service Research 1(1): 5-17.</w:t>
+      </w:r>
+    </w:p>
+    <w:p>
+      <w:pPr>
+        <w:spacing w:line="240" w:lineRule="auto" w:after="120"/>
+        <w:jc w:val="left"/>
+      </w:pPr>
+      <w:r>
+        <w:rPr>
+          <w:rFonts w:ascii="Arial" w:hAnsi="Arial"/>
+          <w:sz w:val="22"/>
+        </w:rPr>
         <w:t>Cameron, A.C.; Trivedi, P.K. 2013. Regression Analysis of Count Data. 2ed. Cambridge University Press, Cambridge, Reino Unido.</w:t>
       </w:r>
     </w:p>
@@ -1401,7 +1414,7 @@
           <w:rFonts w:ascii="Arial" w:hAnsi="Arial"/>
           <w:sz w:val="22"/>
         </w:rPr>
-        <w:t>Fávero, L.P.; Belfiore, P. 2017. Manual de Análise de Dados: Estatística e modelagem multivariada com Excel, SPSS e Stata. Elsevier, Rio de Janeiro, RJ, Brasil.</w:t>
+        <w:t>Fávero, L.P.; Belfiore, P. 2024. Manual de Análise de Dados: Estatística e Machine Learning com Excel, SPSS, Stata, R e Python. 2ed. LTC, Rio de Janeiro, RJ, Brasil.</w:t>
       </w:r>
     </w:p>
     <w:p>
@@ -1440,6 +1453,32 @@
           <w:rFonts w:ascii="Arial" w:hAnsi="Arial"/>
           <w:sz w:val="22"/>
         </w:rPr>
+        <w:t>Luo, X.; Homburg, C. 2007. Neglected outcomes of customer satisfaction. Journal of Marketing 71(2): 133-149.</w:t>
+      </w:r>
+    </w:p>
+    <w:p>
+      <w:pPr>
+        <w:spacing w:line="240" w:lineRule="auto" w:after="120"/>
+        <w:jc w:val="left"/>
+      </w:pPr>
+      <w:r>
+        <w:rPr>
+          <w:rFonts w:ascii="Arial" w:hAnsi="Arial"/>
+          <w:sz w:val="22"/>
+        </w:rPr>
+        <w:t>Mudambi, S.M.; Schuff, D. 2010. What makes a helpful online review? A study of customer reviews on Amazon.com. MIS Quarterly 34(1): 185-200.</w:t>
+      </w:r>
+    </w:p>
+    <w:p>
+      <w:pPr>
+        <w:spacing w:line="240" w:lineRule="auto" w:after="120"/>
+        <w:jc w:val="left"/>
+      </w:pPr>
+      <w:r>
+        <w:rPr>
+          <w:rFonts w:ascii="Arial" w:hAnsi="Arial"/>
+          <w:sz w:val="22"/>
+        </w:rPr>
         <w:t>Olist. 2018. Brazilian E-Commerce Public Dataset by Olist. Disponível em: &lt;https://www.kaggle.com/datasets/olistbr/brazilian-ecommerce&gt;. Acesso em: 20 mar. 2026.</w:t>
       </w:r>
     </w:p>
@@ -1454,6 +1493,19 @@
           <w:sz w:val="22"/>
         </w:rPr>
         <w:t>Parasuraman, A.; Zeithaml, V.A.; Berry, L.L. 1985. A conceptual model of service quality and its implications for future research. Journal of Marketing 49(4): 41-50.</w:t>
+      </w:r>
+    </w:p>
+    <w:p>
+      <w:pPr>
+        <w:spacing w:line="240" w:lineRule="auto" w:after="120"/>
+        <w:jc w:val="left"/>
+      </w:pPr>
+      <w:r>
+        <w:rPr>
+          <w:rFonts w:ascii="Arial" w:hAnsi="Arial"/>
+          <w:sz w:val="22"/>
+        </w:rPr>
+        <w:t>Zhu, F.; Zhang, X. 2010. Impact of online consumer reviews on sales: the moderating role of product and consumer characteristics. Journal of Marketing 74(2): 133-148.</w:t>
       </w:r>
     </w:p>
     <w:sectPr>

</xml_diff>